<commit_message>
Se agregan alumnos y grants, menu y footer para ambas paginas
</commit_message>
<xml_diff>
--- a/AB/PEOPLE.docx
+++ b/AB/PEOPLE.docx
@@ -1,6 +1,6 @@
 
 <file path=word/document.xml><?xml version="1.0" encoding="utf-8"?>
-<w:document xmlns:wpc="http://schemas.microsoft.com/office/word/2010/wordprocessingCanvas" xmlns:cx="http://schemas.microsoft.com/office/drawing/2014/chartex" xmlns:cx1="http://schemas.microsoft.com/office/drawing/2015/9/8/chartex" xmlns:cx2="http://schemas.microsoft.com/office/drawing/2015/10/21/chartex" xmlns:cx3="http://schemas.microsoft.com/office/drawing/2016/5/9/chartex" xmlns:cx4="http://schemas.microsoft.com/office/drawing/2016/5/10/chartex" xmlns:cx5="http://schemas.microsoft.com/office/drawing/2016/5/11/chartex" xmlns:cx6="http://schemas.microsoft.com/office/drawing/2016/5/12/chartex" xmlns:cx7="http://schemas.microsoft.com/office/drawing/2016/5/13/chartex" xmlns:cx8="http://schemas.microsoft.com/office/drawing/2016/5/14/chartex" xmlns:mc="http://schemas.openxmlformats.org/markup-compatibility/2006" xmlns:aink="http://schemas.microsoft.com/office/drawing/2016/ink" xmlns:am3d="http://schemas.microsoft.com/office/drawing/2017/model3d" xmlns:o="urn:schemas-microsoft-com:office:office" xmlns:oel="http://schemas.microsoft.com/office/2019/extlst" xmlns:r="http://schemas.openxmlformats.org/officeDocument/2006/relationships" xmlns:m="http://schemas.openxmlformats.org/officeDocument/2006/math" xmlns:v="urn:schemas-microsoft-com:vml" xmlns:wp14="http://schemas.microsoft.com/office/word/2010/wordprocessingDrawing" xmlns:wp="http://schemas.openxmlformats.org/drawingml/2006/wordprocessingDrawing" xmlns:w10="urn:schemas-microsoft-com:office:word" xmlns:w="http://schemas.openxmlformats.org/wordprocessingml/2006/main" xmlns:w14="http://schemas.microsoft.com/office/word/2010/wordml" xmlns:w15="http://schemas.microsoft.com/office/word/2012/wordml" xmlns:w16cex="http://schemas.microsoft.com/office/word/2018/wordml/cex" xmlns:w16cid="http://schemas.microsoft.com/office/word/2016/wordml/cid" xmlns:w16="http://schemas.microsoft.com/office/word/2018/wordml" xmlns:w16sdtdh="http://schemas.microsoft.com/office/word/2020/wordml/sdtdatahash" xmlns:w16se="http://schemas.microsoft.com/office/word/2015/wordml/symex" xmlns:wpg="http://schemas.microsoft.com/office/word/2010/wordprocessingGroup" xmlns:wpi="http://schemas.microsoft.com/office/word/2010/wordprocessingInk" xmlns:wne="http://schemas.microsoft.com/office/word/2006/wordml" xmlns:wps="http://schemas.microsoft.com/office/word/2010/wordprocessingShape" mc:Ignorable="w14 w15 w16se w16cid w16 w16cex w16sdtdh wp14">
+<w:document xmlns:wpc="http://schemas.microsoft.com/office/word/2010/wordprocessingCanvas" xmlns:cx="http://schemas.microsoft.com/office/drawing/2014/chartex" xmlns:cx1="http://schemas.microsoft.com/office/drawing/2015/9/8/chartex" xmlns:cx2="http://schemas.microsoft.com/office/drawing/2015/10/21/chartex" xmlns:cx3="http://schemas.microsoft.com/office/drawing/2016/5/9/chartex" xmlns:cx4="http://schemas.microsoft.com/office/drawing/2016/5/10/chartex" xmlns:cx5="http://schemas.microsoft.com/office/drawing/2016/5/11/chartex" xmlns:cx6="http://schemas.microsoft.com/office/drawing/2016/5/12/chartex" xmlns:cx7="http://schemas.microsoft.com/office/drawing/2016/5/13/chartex" xmlns:cx8="http://schemas.microsoft.com/office/drawing/2016/5/14/chartex" xmlns:mc="http://schemas.openxmlformats.org/markup-compatibility/2006" xmlns:aink="http://schemas.microsoft.com/office/drawing/2016/ink" xmlns:am3d="http://schemas.microsoft.com/office/drawing/2017/model3d" xmlns:o="urn:schemas-microsoft-com:office:office" xmlns:r="http://schemas.openxmlformats.org/officeDocument/2006/relationships" xmlns:m="http://schemas.openxmlformats.org/officeDocument/2006/math" xmlns:v="urn:schemas-microsoft-com:vml" xmlns:wp14="http://schemas.microsoft.com/office/word/2010/wordprocessingDrawing" xmlns:wp="http://schemas.openxmlformats.org/drawingml/2006/wordprocessingDrawing" xmlns:w10="urn:schemas-microsoft-com:office:word" xmlns:w="http://schemas.openxmlformats.org/wordprocessingml/2006/main" xmlns:w14="http://schemas.microsoft.com/office/word/2010/wordml" xmlns:w15="http://schemas.microsoft.com/office/word/2012/wordml" xmlns:w16cex="http://schemas.microsoft.com/office/word/2018/wordml/cex" xmlns:w16cid="http://schemas.microsoft.com/office/word/2016/wordml/cid" xmlns:w16="http://schemas.microsoft.com/office/word/2018/wordml" xmlns:w16sdtdh="http://schemas.microsoft.com/office/word/2020/wordml/sdtdatahash" xmlns:w16se="http://schemas.microsoft.com/office/word/2015/wordml/symex" xmlns:wpg="http://schemas.microsoft.com/office/word/2010/wordprocessingGroup" xmlns:wpi="http://schemas.microsoft.com/office/word/2010/wordprocessingInk" xmlns:wne="http://schemas.microsoft.com/office/word/2006/wordml" xmlns:wps="http://schemas.microsoft.com/office/word/2010/wordprocessingShape" mc:Ignorable="w14 w15 w16se w16cid w16 w16cex w16sdtdh wp14">
   <w:body>
     <w:p>
       <w:pPr>
@@ -22,28 +22,696 @@
           <w:b/>
           <w:bCs/>
           <w:color w:val="000000"/>
-          <w:sz w:val="36"/>
-          <w:szCs w:val="36"/>
-          <w:lang w:val="en-US" w:eastAsia="es-MX"/>
-        </w:rPr>
-        <w:t>People</w:t>
-      </w:r>
-    </w:p>
-    <w:p>
-      <w:pPr>
-        <w:spacing w:before="100" w:beforeAutospacing="1" w:after="100" w:afterAutospacing="1"/>
-        <w:outlineLvl w:val="2"/>
-        <w:rPr>
-          <w:rFonts w:ascii="Times New Roman" w:eastAsia="Times New Roman" w:hAnsi="Times New Roman" w:cs="Times New Roman"/>
-          <w:b/>
-          <w:bCs/>
-          <w:color w:val="000000"/>
           <w:sz w:val="27"/>
           <w:szCs w:val="27"/>
           <w:lang w:val="en-US" w:eastAsia="es-MX"/>
         </w:rPr>
-      </w:pPr>
-      <w:r>
+        <w:t>Undergraduate Students</w:t>
+      </w:r>
+    </w:p>
+    <w:p>
+      <w:pPr>
+        <w:spacing w:before="100" w:beforeAutospacing="1" w:after="100" w:afterAutospacing="1"/>
+        <w:rPr>
+          <w:rFonts w:ascii="Times New Roman" w:eastAsia="Times New Roman" w:hAnsi="Times New Roman" w:cs="Times New Roman"/>
+          <w:b/>
+          <w:bCs/>
+          <w:color w:val="000000"/>
+          <w:lang w:val="en-US" w:eastAsia="es-MX"/>
+        </w:rPr>
+      </w:pPr>
+      <w:r>
+        <w:rPr>
+          <w:rFonts w:ascii="Times New Roman" w:eastAsia="Times New Roman" w:hAnsi="Times New Roman" w:cs="Times New Roman"/>
+          <w:b/>
+          <w:bCs/>
+          <w:color w:val="000000"/>
+          <w:lang w:val="en-US" w:eastAsia="es-MX"/>
+        </w:rPr>
+        <w:t>Class of 2025</w:t>
+      </w:r>
+    </w:p>
+    <w:p>
+      <w:pPr>
+        <w:spacing w:before="100" w:beforeAutospacing="1" w:after="100" w:afterAutospacing="1"/>
+        <w:rPr>
+          <w:rFonts w:ascii="Times New Roman" w:eastAsia="Times New Roman" w:hAnsi="Times New Roman" w:cs="Times New Roman"/>
+          <w:color w:val="000000"/>
+          <w:lang w:val="en-US" w:eastAsia="es-MX"/>
+        </w:rPr>
+      </w:pPr>
+      <w:r>
+        <w:rPr>
+          <w:rFonts w:ascii="Times New Roman" w:eastAsia="Times New Roman" w:hAnsi="Times New Roman" w:cs="Times New Roman"/>
+          <w:color w:val="000000"/>
+          <w:lang w:val="en-US" w:eastAsia="es-MX"/>
+        </w:rPr>
+        <w:t>Francisca San Martín</w:t>
+      </w:r>
+    </w:p>
+    <w:p>
+      <w:pPr>
+        <w:spacing w:before="100" w:beforeAutospacing="1" w:after="100" w:afterAutospacing="1"/>
+        <w:rPr>
+          <w:rFonts w:ascii="Times New Roman" w:eastAsia="Times New Roman" w:hAnsi="Times New Roman" w:cs="Times New Roman"/>
+          <w:color w:val="000000"/>
+          <w:lang w:val="en-US" w:eastAsia="es-MX"/>
+        </w:rPr>
+      </w:pPr>
+      <w:r>
+        <w:rPr>
+          <w:rFonts w:ascii="Times New Roman" w:eastAsia="Times New Roman" w:hAnsi="Times New Roman" w:cs="Times New Roman"/>
+          <w:color w:val="000000"/>
+          <w:lang w:val="en-US" w:eastAsia="es-MX"/>
+        </w:rPr>
+        <w:t>Javier Rivera</w:t>
+      </w:r>
+    </w:p>
+    <w:p>
+      <w:pPr>
+        <w:spacing w:before="100" w:beforeAutospacing="1" w:after="100" w:afterAutospacing="1"/>
+        <w:rPr>
+          <w:rFonts w:ascii="Times New Roman" w:eastAsia="Times New Roman" w:hAnsi="Times New Roman" w:cs="Times New Roman"/>
+          <w:color w:val="000000"/>
+          <w:lang w:val="en-US" w:eastAsia="es-MX"/>
+        </w:rPr>
+      </w:pPr>
+      <w:r>
+        <w:rPr>
+          <w:rFonts w:ascii="Times New Roman" w:eastAsia="Times New Roman" w:hAnsi="Times New Roman" w:cs="Times New Roman"/>
+          <w:color w:val="000000"/>
+          <w:lang w:val="en-US" w:eastAsia="es-MX"/>
+        </w:rPr>
+        <w:t>Danae Tapia</w:t>
+      </w:r>
+    </w:p>
+    <w:p>
+      <w:pPr>
+        <w:spacing w:before="100" w:beforeAutospacing="1" w:after="100" w:afterAutospacing="1"/>
+        <w:rPr>
+          <w:rFonts w:ascii="Times New Roman" w:eastAsia="Times New Roman" w:hAnsi="Times New Roman" w:cs="Times New Roman"/>
+          <w:color w:val="000000"/>
+          <w:lang w:val="en-US" w:eastAsia="es-MX"/>
+        </w:rPr>
+      </w:pPr>
+      <w:r>
+        <w:rPr>
+          <w:rFonts w:ascii="Times New Roman" w:eastAsia="Times New Roman" w:hAnsi="Times New Roman" w:cs="Times New Roman"/>
+          <w:color w:val="000000"/>
+          <w:lang w:val="en-US" w:eastAsia="es-MX"/>
+        </w:rPr>
+        <w:t xml:space="preserve">Francisca </w:t>
+      </w:r>
+      <w:proofErr w:type="spellStart"/>
+      <w:r>
+        <w:rPr>
+          <w:rFonts w:ascii="Times New Roman" w:eastAsia="Times New Roman" w:hAnsi="Times New Roman" w:cs="Times New Roman"/>
+          <w:color w:val="000000"/>
+          <w:lang w:val="en-US" w:eastAsia="es-MX"/>
+        </w:rPr>
+        <w:t>Leiva</w:t>
+      </w:r>
+      <w:proofErr w:type="spellEnd"/>
+    </w:p>
+    <w:p>
+      <w:pPr>
+        <w:spacing w:before="100" w:beforeAutospacing="1" w:after="100" w:afterAutospacing="1"/>
+        <w:rPr>
+          <w:rFonts w:ascii="Times New Roman" w:eastAsia="Times New Roman" w:hAnsi="Times New Roman" w:cs="Times New Roman"/>
+          <w:color w:val="000000"/>
+          <w:lang w:val="en-US" w:eastAsia="es-MX"/>
+        </w:rPr>
+      </w:pPr>
+      <w:r>
+        <w:rPr>
+          <w:rFonts w:ascii="Times New Roman" w:eastAsia="Times New Roman" w:hAnsi="Times New Roman" w:cs="Times New Roman"/>
+          <w:color w:val="000000"/>
+          <w:lang w:val="en-US" w:eastAsia="es-MX"/>
+        </w:rPr>
+        <w:t>Ruth Camargo</w:t>
+      </w:r>
+    </w:p>
+    <w:p>
+      <w:pPr>
+        <w:spacing w:before="100" w:beforeAutospacing="1" w:after="100" w:afterAutospacing="1"/>
+        <w:rPr>
+          <w:rFonts w:ascii="Times New Roman" w:eastAsia="Times New Roman" w:hAnsi="Times New Roman" w:cs="Times New Roman"/>
+          <w:color w:val="000000"/>
+          <w:lang w:val="en-US" w:eastAsia="es-MX"/>
+        </w:rPr>
+      </w:pPr>
+      <w:r>
+        <w:rPr>
+          <w:rFonts w:ascii="Times New Roman" w:eastAsia="Times New Roman" w:hAnsi="Times New Roman" w:cs="Times New Roman"/>
+          <w:color w:val="000000"/>
+          <w:lang w:val="en-US" w:eastAsia="es-MX"/>
+        </w:rPr>
+        <w:t>J</w:t>
+      </w:r>
+      <w:r>
+        <w:rPr>
+          <w:rFonts w:ascii="Times New Roman" w:eastAsia="Times New Roman" w:hAnsi="Times New Roman" w:cs="Times New Roman"/>
+          <w:color w:val="000000"/>
+          <w:lang w:val="en-US" w:eastAsia="es-MX"/>
+        </w:rPr>
+        <w:t xml:space="preserve">oaquín </w:t>
+      </w:r>
+      <w:proofErr w:type="spellStart"/>
+      <w:r>
+        <w:rPr>
+          <w:rFonts w:ascii="Times New Roman" w:eastAsia="Times New Roman" w:hAnsi="Times New Roman" w:cs="Times New Roman"/>
+          <w:color w:val="000000"/>
+          <w:lang w:val="en-US" w:eastAsia="es-MX"/>
+        </w:rPr>
+        <w:t>Olivos</w:t>
+      </w:r>
+      <w:proofErr w:type="spellEnd"/>
+    </w:p>
+    <w:p>
+      <w:pPr>
+        <w:spacing w:before="100" w:beforeAutospacing="1" w:after="100" w:afterAutospacing="1"/>
+        <w:rPr>
+          <w:rFonts w:ascii="Times New Roman" w:eastAsia="Times New Roman" w:hAnsi="Times New Roman" w:cs="Times New Roman"/>
+          <w:color w:val="000000"/>
+          <w:lang w:val="en-US" w:eastAsia="es-MX"/>
+        </w:rPr>
+      </w:pPr>
+      <w:proofErr w:type="spellStart"/>
+      <w:r>
+        <w:rPr>
+          <w:rFonts w:ascii="Times New Roman" w:eastAsia="Times New Roman" w:hAnsi="Times New Roman" w:cs="Times New Roman"/>
+          <w:color w:val="000000"/>
+          <w:lang w:val="en-US" w:eastAsia="es-MX"/>
+        </w:rPr>
+        <w:t>R</w:t>
+      </w:r>
+      <w:r>
+        <w:rPr>
+          <w:rFonts w:ascii="Times New Roman" w:eastAsia="Times New Roman" w:hAnsi="Times New Roman" w:cs="Times New Roman"/>
+          <w:color w:val="000000"/>
+          <w:lang w:val="en-US" w:eastAsia="es-MX"/>
+        </w:rPr>
+        <w:t>esef</w:t>
+      </w:r>
+      <w:proofErr w:type="spellEnd"/>
+      <w:r>
+        <w:rPr>
+          <w:rFonts w:ascii="Times New Roman" w:eastAsia="Times New Roman" w:hAnsi="Times New Roman" w:cs="Times New Roman"/>
+          <w:color w:val="000000"/>
+          <w:lang w:val="en-US" w:eastAsia="es-MX"/>
+        </w:rPr>
+        <w:t xml:space="preserve"> Contreras (UST)</w:t>
+      </w:r>
+    </w:p>
+    <w:p>
+      <w:pPr>
+        <w:spacing w:before="100" w:beforeAutospacing="1" w:after="100" w:afterAutospacing="1"/>
+        <w:rPr>
+          <w:rFonts w:ascii="Times New Roman" w:eastAsia="Times New Roman" w:hAnsi="Times New Roman" w:cs="Times New Roman"/>
+          <w:color w:val="000000"/>
+          <w:lang w:val="en-US" w:eastAsia="es-MX"/>
+        </w:rPr>
+      </w:pPr>
+      <w:r>
+        <w:rPr>
+          <w:rFonts w:ascii="Times New Roman" w:eastAsia="Times New Roman" w:hAnsi="Times New Roman" w:cs="Times New Roman"/>
+          <w:color w:val="000000"/>
+          <w:lang w:val="en-US" w:eastAsia="es-MX"/>
+        </w:rPr>
+        <w:t>Willy Espinoza</w:t>
+      </w:r>
+    </w:p>
+    <w:p>
+      <w:pPr>
+        <w:spacing w:before="100" w:beforeAutospacing="1" w:after="100" w:afterAutospacing="1"/>
+        <w:rPr>
+          <w:rFonts w:ascii="Times New Roman" w:eastAsia="Times New Roman" w:hAnsi="Times New Roman" w:cs="Times New Roman"/>
+          <w:color w:val="000000"/>
+          <w:lang w:val="en-US" w:eastAsia="es-MX"/>
+        </w:rPr>
+      </w:pPr>
+      <w:r>
+        <w:rPr>
+          <w:rFonts w:ascii="Times New Roman" w:eastAsia="Times New Roman" w:hAnsi="Times New Roman" w:cs="Times New Roman"/>
+          <w:color w:val="000000"/>
+          <w:lang w:val="en-US" w:eastAsia="es-MX"/>
+        </w:rPr>
+        <w:t xml:space="preserve">Mónica </w:t>
+      </w:r>
+      <w:proofErr w:type="spellStart"/>
+      <w:r>
+        <w:rPr>
+          <w:rFonts w:ascii="Times New Roman" w:eastAsia="Times New Roman" w:hAnsi="Times New Roman" w:cs="Times New Roman"/>
+          <w:color w:val="000000"/>
+          <w:lang w:val="en-US" w:eastAsia="es-MX"/>
+        </w:rPr>
+        <w:t>Conforti</w:t>
+      </w:r>
+      <w:proofErr w:type="spellEnd"/>
+    </w:p>
+    <w:p>
+      <w:pPr>
+        <w:spacing w:before="100" w:beforeAutospacing="1" w:after="100" w:afterAutospacing="1"/>
+        <w:rPr>
+          <w:rFonts w:ascii="Times New Roman" w:eastAsia="Times New Roman" w:hAnsi="Times New Roman" w:cs="Times New Roman"/>
+          <w:color w:val="000000"/>
+          <w:lang w:val="en-US" w:eastAsia="es-MX"/>
+        </w:rPr>
+      </w:pPr>
+    </w:p>
+    <w:p>
+      <w:pPr>
+        <w:spacing w:before="100" w:beforeAutospacing="1" w:after="100" w:afterAutospacing="1"/>
+        <w:rPr>
+          <w:rFonts w:ascii="Times New Roman" w:eastAsia="Times New Roman" w:hAnsi="Times New Roman" w:cs="Times New Roman"/>
+          <w:color w:val="000000"/>
+          <w:lang w:val="en-US" w:eastAsia="es-MX"/>
+        </w:rPr>
+      </w:pPr>
+    </w:p>
+    <w:p>
+      <w:pPr>
+        <w:spacing w:before="100" w:beforeAutospacing="1" w:after="100" w:afterAutospacing="1"/>
+        <w:rPr>
+          <w:rFonts w:ascii="Times New Roman" w:eastAsia="Times New Roman" w:hAnsi="Times New Roman" w:cs="Times New Roman"/>
+          <w:b/>
+          <w:bCs/>
+          <w:color w:val="000000"/>
+          <w:lang w:val="en-US" w:eastAsia="es-MX"/>
+        </w:rPr>
+      </w:pPr>
+      <w:r>
+        <w:rPr>
+          <w:rFonts w:ascii="Times New Roman" w:eastAsia="Times New Roman" w:hAnsi="Times New Roman" w:cs="Times New Roman"/>
+          <w:b/>
+          <w:bCs/>
+          <w:color w:val="000000"/>
+          <w:lang w:val="en-US" w:eastAsia="es-MX"/>
+        </w:rPr>
+        <w:t>Class of 2024</w:t>
+      </w:r>
+    </w:p>
+    <w:p>
+      <w:pPr>
+        <w:spacing w:before="100" w:beforeAutospacing="1" w:after="100" w:afterAutospacing="1"/>
+        <w:rPr>
+          <w:rFonts w:ascii="Times New Roman" w:eastAsia="Times New Roman" w:hAnsi="Times New Roman" w:cs="Times New Roman"/>
+          <w:color w:val="000000"/>
+          <w:lang w:val="en-US" w:eastAsia="es-MX"/>
+        </w:rPr>
+      </w:pPr>
+      <w:proofErr w:type="spellStart"/>
+      <w:r>
+        <w:rPr>
+          <w:rFonts w:ascii="Times New Roman" w:eastAsia="Times New Roman" w:hAnsi="Times New Roman" w:cs="Times New Roman"/>
+          <w:color w:val="000000"/>
+          <w:lang w:val="en-US" w:eastAsia="es-MX"/>
+        </w:rPr>
+        <w:t>Matías</w:t>
+      </w:r>
+      <w:proofErr w:type="spellEnd"/>
+      <w:r>
+        <w:rPr>
+          <w:rFonts w:ascii="Times New Roman" w:eastAsia="Times New Roman" w:hAnsi="Times New Roman" w:cs="Times New Roman"/>
+          <w:color w:val="000000"/>
+          <w:lang w:val="en-US" w:eastAsia="es-MX"/>
+        </w:rPr>
+        <w:t xml:space="preserve"> Vergara</w:t>
+      </w:r>
+    </w:p>
+    <w:p>
+      <w:pPr>
+        <w:spacing w:before="100" w:beforeAutospacing="1" w:after="100" w:afterAutospacing="1"/>
+        <w:rPr>
+          <w:rFonts w:ascii="Times New Roman" w:eastAsia="Times New Roman" w:hAnsi="Times New Roman" w:cs="Times New Roman"/>
+          <w:color w:val="000000"/>
+          <w:lang w:val="en-US" w:eastAsia="es-MX"/>
+        </w:rPr>
+      </w:pPr>
+      <w:r>
+        <w:rPr>
+          <w:rFonts w:ascii="Times New Roman" w:eastAsia="Times New Roman" w:hAnsi="Times New Roman" w:cs="Times New Roman"/>
+          <w:color w:val="000000"/>
+          <w:lang w:val="en-US" w:eastAsia="es-MX"/>
+        </w:rPr>
+        <w:t xml:space="preserve">Armando </w:t>
+      </w:r>
+      <w:proofErr w:type="spellStart"/>
+      <w:r>
+        <w:rPr>
+          <w:rFonts w:ascii="Times New Roman" w:eastAsia="Times New Roman" w:hAnsi="Times New Roman" w:cs="Times New Roman"/>
+          <w:color w:val="000000"/>
+          <w:lang w:val="en-US" w:eastAsia="es-MX"/>
+        </w:rPr>
+        <w:t>Norambuena</w:t>
+      </w:r>
+      <w:proofErr w:type="spellEnd"/>
+    </w:p>
+    <w:p>
+      <w:pPr>
+        <w:spacing w:before="100" w:beforeAutospacing="1" w:after="100" w:afterAutospacing="1"/>
+        <w:rPr>
+          <w:rFonts w:ascii="Times New Roman" w:eastAsia="Times New Roman" w:hAnsi="Times New Roman" w:cs="Times New Roman"/>
+          <w:color w:val="000000"/>
+          <w:lang w:val="en-US" w:eastAsia="es-MX"/>
+        </w:rPr>
+      </w:pPr>
+      <w:r>
+        <w:rPr>
+          <w:rFonts w:ascii="Times New Roman" w:eastAsia="Times New Roman" w:hAnsi="Times New Roman" w:cs="Times New Roman"/>
+          <w:color w:val="000000"/>
+          <w:lang w:val="en-US" w:eastAsia="es-MX"/>
+        </w:rPr>
+        <w:t>Paula Cerda</w:t>
+      </w:r>
+    </w:p>
+    <w:p>
+      <w:pPr>
+        <w:spacing w:before="100" w:beforeAutospacing="1" w:after="100" w:afterAutospacing="1"/>
+        <w:rPr>
+          <w:rFonts w:ascii="Times New Roman" w:eastAsia="Times New Roman" w:hAnsi="Times New Roman" w:cs="Times New Roman"/>
+          <w:b/>
+          <w:bCs/>
+          <w:color w:val="000000"/>
+          <w:lang w:val="en-US" w:eastAsia="es-MX"/>
+        </w:rPr>
+      </w:pPr>
+    </w:p>
+    <w:p>
+      <w:pPr>
+        <w:spacing w:before="100" w:beforeAutospacing="1" w:after="100" w:afterAutospacing="1"/>
+        <w:rPr>
+          <w:rFonts w:ascii="Times New Roman" w:eastAsia="Times New Roman" w:hAnsi="Times New Roman" w:cs="Times New Roman"/>
+          <w:b/>
+          <w:bCs/>
+          <w:color w:val="000000"/>
+          <w:lang w:val="en-US" w:eastAsia="es-MX"/>
+        </w:rPr>
+      </w:pPr>
+    </w:p>
+    <w:p>
+      <w:pPr>
+        <w:spacing w:before="100" w:beforeAutospacing="1" w:after="100" w:afterAutospacing="1"/>
+        <w:rPr>
+          <w:rFonts w:ascii="Times New Roman" w:eastAsia="Times New Roman" w:hAnsi="Times New Roman" w:cs="Times New Roman"/>
+          <w:b/>
+          <w:bCs/>
+          <w:color w:val="000000"/>
+          <w:lang w:val="en-US" w:eastAsia="es-MX"/>
+        </w:rPr>
+      </w:pPr>
+      <w:r>
+        <w:rPr>
+          <w:rFonts w:ascii="Times New Roman" w:eastAsia="Times New Roman" w:hAnsi="Times New Roman" w:cs="Times New Roman"/>
+          <w:b/>
+          <w:bCs/>
+          <w:color w:val="000000"/>
+          <w:lang w:val="en-US" w:eastAsia="es-MX"/>
+        </w:rPr>
+        <w:t>Class of 2023</w:t>
+      </w:r>
+    </w:p>
+    <w:p>
+      <w:pPr>
+        <w:spacing w:before="100" w:beforeAutospacing="1" w:after="100" w:afterAutospacing="1"/>
+        <w:rPr>
+          <w:rFonts w:ascii="Times New Roman" w:eastAsia="Times New Roman" w:hAnsi="Times New Roman" w:cs="Times New Roman"/>
+          <w:color w:val="000000"/>
+          <w:lang w:val="en-US" w:eastAsia="es-MX"/>
+        </w:rPr>
+      </w:pPr>
+      <w:proofErr w:type="spellStart"/>
+      <w:r>
+        <w:rPr>
+          <w:rFonts w:ascii="Times New Roman" w:eastAsia="Times New Roman" w:hAnsi="Times New Roman" w:cs="Times New Roman"/>
+          <w:color w:val="000000"/>
+          <w:lang w:val="en-US" w:eastAsia="es-MX"/>
+        </w:rPr>
+        <w:t>Jovely</w:t>
+      </w:r>
+      <w:proofErr w:type="spellEnd"/>
+      <w:r>
+        <w:rPr>
+          <w:rFonts w:ascii="Times New Roman" w:eastAsia="Times New Roman" w:hAnsi="Times New Roman" w:cs="Times New Roman"/>
+          <w:color w:val="000000"/>
+          <w:lang w:val="en-US" w:eastAsia="es-MX"/>
+        </w:rPr>
+        <w:t xml:space="preserve"> Silva</w:t>
+      </w:r>
+    </w:p>
+    <w:p>
+      <w:pPr>
+        <w:spacing w:before="100" w:beforeAutospacing="1" w:after="100" w:afterAutospacing="1"/>
+        <w:rPr>
+          <w:rFonts w:ascii="Times New Roman" w:eastAsia="Times New Roman" w:hAnsi="Times New Roman" w:cs="Times New Roman"/>
+          <w:color w:val="000000"/>
+          <w:lang w:val="en-US" w:eastAsia="es-MX"/>
+        </w:rPr>
+      </w:pPr>
+      <w:r>
+        <w:rPr>
+          <w:rFonts w:ascii="Times New Roman" w:eastAsia="Times New Roman" w:hAnsi="Times New Roman" w:cs="Times New Roman"/>
+          <w:color w:val="000000"/>
+          <w:lang w:val="en-US" w:eastAsia="es-MX"/>
+        </w:rPr>
+        <w:t xml:space="preserve">Constanza </w:t>
+      </w:r>
+      <w:proofErr w:type="spellStart"/>
+      <w:r>
+        <w:rPr>
+          <w:rFonts w:ascii="Times New Roman" w:eastAsia="Times New Roman" w:hAnsi="Times New Roman" w:cs="Times New Roman"/>
+          <w:color w:val="000000"/>
+          <w:lang w:val="en-US" w:eastAsia="es-MX"/>
+        </w:rPr>
+        <w:t>Quizás</w:t>
+      </w:r>
+      <w:proofErr w:type="spellEnd"/>
+    </w:p>
+    <w:p>
+      <w:pPr>
+        <w:spacing w:before="100" w:beforeAutospacing="1" w:after="100" w:afterAutospacing="1"/>
+        <w:rPr>
+          <w:rFonts w:ascii="Times New Roman" w:eastAsia="Times New Roman" w:hAnsi="Times New Roman" w:cs="Times New Roman"/>
+          <w:color w:val="000000"/>
+          <w:lang w:val="en-US" w:eastAsia="es-MX"/>
+        </w:rPr>
+      </w:pPr>
+      <w:r>
+        <w:rPr>
+          <w:rFonts w:ascii="Times New Roman" w:eastAsia="Times New Roman" w:hAnsi="Times New Roman" w:cs="Times New Roman"/>
+          <w:color w:val="000000"/>
+          <w:lang w:val="en-US" w:eastAsia="es-MX"/>
+        </w:rPr>
+        <w:t>Noelia Arroyo</w:t>
+      </w:r>
+    </w:p>
+    <w:p>
+      <w:pPr>
+        <w:spacing w:before="100" w:beforeAutospacing="1" w:after="100" w:afterAutospacing="1"/>
+        <w:rPr>
+          <w:rFonts w:ascii="Times New Roman" w:eastAsia="Times New Roman" w:hAnsi="Times New Roman" w:cs="Times New Roman"/>
+          <w:color w:val="000000"/>
+          <w:lang w:val="en-US" w:eastAsia="es-MX"/>
+        </w:rPr>
+      </w:pPr>
+      <w:r>
+        <w:rPr>
+          <w:rFonts w:ascii="Times New Roman" w:eastAsia="Times New Roman" w:hAnsi="Times New Roman" w:cs="Times New Roman"/>
+          <w:color w:val="000000"/>
+          <w:lang w:val="en-US" w:eastAsia="es-MX"/>
+        </w:rPr>
+        <w:t>Valentina Zamorano</w:t>
+      </w:r>
+    </w:p>
+    <w:p>
+      <w:pPr>
+        <w:spacing w:before="100" w:beforeAutospacing="1" w:after="100" w:afterAutospacing="1"/>
+        <w:rPr>
+          <w:rFonts w:ascii="Times New Roman" w:eastAsia="Times New Roman" w:hAnsi="Times New Roman" w:cs="Times New Roman"/>
+          <w:color w:val="000000"/>
+          <w:lang w:val="en-US" w:eastAsia="es-MX"/>
+        </w:rPr>
+      </w:pPr>
+      <w:r>
+        <w:rPr>
+          <w:rFonts w:ascii="Times New Roman" w:eastAsia="Times New Roman" w:hAnsi="Times New Roman" w:cs="Times New Roman"/>
+          <w:color w:val="000000"/>
+          <w:lang w:val="en-US" w:eastAsia="es-MX"/>
+        </w:rPr>
+        <w:t>Giovanni Aguilar</w:t>
+      </w:r>
+    </w:p>
+    <w:p>
+      <w:pPr>
+        <w:spacing w:before="100" w:beforeAutospacing="1" w:after="100" w:afterAutospacing="1"/>
+        <w:rPr>
+          <w:rFonts w:ascii="Times New Roman" w:eastAsia="Times New Roman" w:hAnsi="Times New Roman" w:cs="Times New Roman"/>
+          <w:color w:val="000000"/>
+          <w:lang w:val="en-US" w:eastAsia="es-MX"/>
+        </w:rPr>
+      </w:pPr>
+      <w:proofErr w:type="spellStart"/>
+      <w:r>
+        <w:rPr>
+          <w:rFonts w:ascii="Times New Roman" w:eastAsia="Times New Roman" w:hAnsi="Times New Roman" w:cs="Times New Roman"/>
+          <w:color w:val="000000"/>
+          <w:lang w:val="en-US" w:eastAsia="es-MX"/>
+        </w:rPr>
+        <w:t>Guiseppe</w:t>
+      </w:r>
+      <w:proofErr w:type="spellEnd"/>
+      <w:r>
+        <w:rPr>
+          <w:rFonts w:ascii="Times New Roman" w:eastAsia="Times New Roman" w:hAnsi="Times New Roman" w:cs="Times New Roman"/>
+          <w:color w:val="000000"/>
+          <w:lang w:val="en-US" w:eastAsia="es-MX"/>
+        </w:rPr>
+        <w:t xml:space="preserve"> </w:t>
+      </w:r>
+      <w:proofErr w:type="spellStart"/>
+      <w:r>
+        <w:rPr>
+          <w:rFonts w:ascii="Times New Roman" w:eastAsia="Times New Roman" w:hAnsi="Times New Roman" w:cs="Times New Roman"/>
+          <w:color w:val="000000"/>
+          <w:lang w:val="en-US" w:eastAsia="es-MX"/>
+        </w:rPr>
+        <w:t>Balsarini</w:t>
+      </w:r>
+      <w:proofErr w:type="spellEnd"/>
+    </w:p>
+    <w:p>
+      <w:pPr>
+        <w:spacing w:before="100" w:beforeAutospacing="1" w:after="100" w:afterAutospacing="1"/>
+        <w:rPr>
+          <w:rFonts w:ascii="Times New Roman" w:eastAsia="Times New Roman" w:hAnsi="Times New Roman" w:cs="Times New Roman"/>
+          <w:color w:val="000000"/>
+          <w:lang w:val="en-US" w:eastAsia="es-MX"/>
+        </w:rPr>
+      </w:pPr>
+      <w:r>
+        <w:rPr>
+          <w:rFonts w:ascii="Times New Roman" w:eastAsia="Times New Roman" w:hAnsi="Times New Roman" w:cs="Times New Roman"/>
+          <w:color w:val="000000"/>
+          <w:lang w:val="en-US" w:eastAsia="es-MX"/>
+        </w:rPr>
+        <w:t xml:space="preserve">Tamara </w:t>
+      </w:r>
+      <w:proofErr w:type="spellStart"/>
+      <w:r>
+        <w:rPr>
+          <w:rFonts w:ascii="Times New Roman" w:eastAsia="Times New Roman" w:hAnsi="Times New Roman" w:cs="Times New Roman"/>
+          <w:color w:val="000000"/>
+          <w:lang w:val="en-US" w:eastAsia="es-MX"/>
+        </w:rPr>
+        <w:t>Lazcano</w:t>
+      </w:r>
+      <w:proofErr w:type="spellEnd"/>
+    </w:p>
+    <w:p>
+      <w:pPr>
+        <w:spacing w:before="100" w:beforeAutospacing="1" w:after="100" w:afterAutospacing="1"/>
+        <w:rPr>
+          <w:rFonts w:ascii="Times New Roman" w:eastAsia="Times New Roman" w:hAnsi="Times New Roman" w:cs="Times New Roman"/>
+          <w:b/>
+          <w:bCs/>
+          <w:color w:val="000000"/>
+          <w:lang w:val="en-US" w:eastAsia="es-MX"/>
+        </w:rPr>
+      </w:pPr>
+    </w:p>
+    <w:p>
+      <w:pPr>
+        <w:spacing w:before="100" w:beforeAutospacing="1" w:after="100" w:afterAutospacing="1"/>
+        <w:rPr>
+          <w:rFonts w:ascii="Times New Roman" w:eastAsia="Times New Roman" w:hAnsi="Times New Roman" w:cs="Times New Roman"/>
+          <w:b/>
+          <w:bCs/>
+          <w:color w:val="000000"/>
+          <w:lang w:val="en-US" w:eastAsia="es-MX"/>
+        </w:rPr>
+      </w:pPr>
+    </w:p>
+    <w:p>
+      <w:pPr>
+        <w:spacing w:before="100" w:beforeAutospacing="1" w:after="100" w:afterAutospacing="1"/>
+        <w:rPr>
+          <w:rFonts w:ascii="Times New Roman" w:eastAsia="Times New Roman" w:hAnsi="Times New Roman" w:cs="Times New Roman"/>
+          <w:b/>
+          <w:bCs/>
+          <w:color w:val="000000"/>
+          <w:lang w:val="en-US" w:eastAsia="es-MX"/>
+        </w:rPr>
+      </w:pPr>
+      <w:r>
+        <w:rPr>
+          <w:rFonts w:ascii="Times New Roman" w:eastAsia="Times New Roman" w:hAnsi="Times New Roman" w:cs="Times New Roman"/>
+          <w:b/>
+          <w:bCs/>
+          <w:color w:val="000000"/>
+          <w:lang w:val="en-US" w:eastAsia="es-MX"/>
+        </w:rPr>
+        <w:t>Class of 2022</w:t>
+      </w:r>
+    </w:p>
+    <w:p>
+      <w:pPr>
+        <w:spacing w:before="100" w:beforeAutospacing="1" w:after="100" w:afterAutospacing="1"/>
+        <w:rPr>
+          <w:rFonts w:ascii="Times New Roman" w:eastAsia="Times New Roman" w:hAnsi="Times New Roman" w:cs="Times New Roman"/>
+          <w:color w:val="000000"/>
+          <w:lang w:val="en-US" w:eastAsia="es-MX"/>
+        </w:rPr>
+      </w:pPr>
+      <w:r>
+        <w:rPr>
+          <w:rFonts w:ascii="Times New Roman" w:eastAsia="Times New Roman" w:hAnsi="Times New Roman" w:cs="Times New Roman"/>
+          <w:color w:val="000000"/>
+          <w:lang w:val="en-US" w:eastAsia="es-MX"/>
+        </w:rPr>
+        <w:t>Leslie Belmar (UCT)</w:t>
+      </w:r>
+    </w:p>
+    <w:p>
+      <w:pPr>
+        <w:spacing w:before="100" w:beforeAutospacing="1" w:after="100" w:afterAutospacing="1"/>
+        <w:rPr>
+          <w:rFonts w:ascii="Times New Roman" w:eastAsia="Times New Roman" w:hAnsi="Times New Roman" w:cs="Times New Roman"/>
+          <w:color w:val="000000"/>
+          <w:lang w:val="en-US" w:eastAsia="es-MX"/>
+        </w:rPr>
+      </w:pPr>
+      <w:r>
+        <w:rPr>
+          <w:rFonts w:ascii="Times New Roman" w:eastAsia="Times New Roman" w:hAnsi="Times New Roman" w:cs="Times New Roman"/>
+          <w:color w:val="000000"/>
+          <w:lang w:val="en-US" w:eastAsia="es-MX"/>
+        </w:rPr>
+        <w:t xml:space="preserve">Mariana </w:t>
+      </w:r>
+      <w:proofErr w:type="spellStart"/>
+      <w:r>
+        <w:rPr>
+          <w:rFonts w:ascii="Times New Roman" w:eastAsia="Times New Roman" w:hAnsi="Times New Roman" w:cs="Times New Roman"/>
+          <w:color w:val="000000"/>
+          <w:lang w:val="en-US" w:eastAsia="es-MX"/>
+        </w:rPr>
+        <w:t>Manzor</w:t>
+      </w:r>
+      <w:proofErr w:type="spellEnd"/>
+    </w:p>
+    <w:p>
+      <w:pPr>
+        <w:spacing w:before="100" w:beforeAutospacing="1" w:after="100" w:afterAutospacing="1"/>
+        <w:rPr>
+          <w:rFonts w:ascii="Times New Roman" w:eastAsia="Times New Roman" w:hAnsi="Times New Roman" w:cs="Times New Roman"/>
+          <w:color w:val="000000"/>
+          <w:lang w:val="en-US" w:eastAsia="es-MX"/>
+        </w:rPr>
+      </w:pPr>
+    </w:p>
+    <w:p>
+      <w:pPr>
+        <w:spacing w:before="100" w:beforeAutospacing="1" w:after="100" w:afterAutospacing="1"/>
         <w:rPr>
           <w:rFonts w:ascii="Times New Roman" w:eastAsia="Times New Roman" w:hAnsi="Times New Roman" w:cs="Times New Roman"/>
           <w:b/>
@@ -53,68 +721,8 @@
           <w:szCs w:val="27"/>
           <w:lang w:val="en-US" w:eastAsia="es-MX"/>
         </w:rPr>
-        <w:t>Head of Laboratory</w:t>
-      </w:r>
-    </w:p>
-    <w:p>
-      <w:pPr>
-        <w:spacing w:before="100" w:beforeAutospacing="1" w:after="100" w:afterAutospacing="1"/>
-        <w:rPr>
-          <w:rFonts w:ascii="Times New Roman" w:eastAsia="Times New Roman" w:hAnsi="Times New Roman" w:cs="Times New Roman"/>
-          <w:color w:val="000000"/>
-          <w:lang w:val="en-US" w:eastAsia="es-MX"/>
-        </w:rPr>
-      </w:pPr>
-      <w:r>
-        <w:rPr>
-          <w:rFonts w:ascii="Times New Roman" w:eastAsia="Times New Roman" w:hAnsi="Times New Roman" w:cs="Times New Roman"/>
-          <w:b/>
-          <w:bCs/>
-          <w:color w:val="000000"/>
-          <w:lang w:val="en-US" w:eastAsia="es-MX"/>
-        </w:rPr>
-        <w:t>Paulo Salinas, DVM, PhD</w:t>
-      </w:r>
-      <w:r>
-        <w:rPr>
-          <w:rFonts w:ascii="Times New Roman" w:eastAsia="Times New Roman" w:hAnsi="Times New Roman" w:cs="Times New Roman"/>
-          <w:color w:val="000000"/>
-          <w:lang w:val="en-US" w:eastAsia="es-MX"/>
-        </w:rPr>
-        <w:br/>
-      </w:r>
-      <w:r>
-        <w:rPr>
-          <w:rFonts w:ascii="Times New Roman" w:eastAsia="Times New Roman" w:hAnsi="Times New Roman" w:cs="Times New Roman"/>
-          <w:i/>
-          <w:iCs/>
-          <w:color w:val="000000"/>
-          <w:lang w:val="en-US" w:eastAsia="es-MX"/>
-        </w:rPr>
-        <w:t>Principal Investigator</w:t>
-      </w:r>
-      <w:r>
-        <w:rPr>
-          <w:rFonts w:ascii="Times New Roman" w:eastAsia="Times New Roman" w:hAnsi="Times New Roman" w:cs="Times New Roman"/>
-          <w:color w:val="000000"/>
-          <w:lang w:val="en-US" w:eastAsia="es-MX"/>
-        </w:rPr>
-        <w:br/>
-        <w:t>Pontifical Catholic University of Valparaíso (PUCV)</w:t>
-      </w:r>
-    </w:p>
-    <w:p>
-      <w:pPr>
-        <w:rPr>
-          <w:rFonts w:ascii="Times New Roman" w:eastAsia="Times New Roman" w:hAnsi="Times New Roman" w:cs="Times New Roman"/>
-          <w:lang w:val="en-US" w:eastAsia="es-MX"/>
-        </w:rPr>
-      </w:pPr>
-    </w:p>
-    <w:p>
-      <w:pPr>
-        <w:spacing w:before="100" w:beforeAutospacing="1" w:after="100" w:afterAutospacing="1"/>
-        <w:outlineLvl w:val="2"/>
+      </w:pPr>
+      <w:r>
         <w:rPr>
           <w:rFonts w:ascii="Times New Roman" w:eastAsia="Times New Roman" w:hAnsi="Times New Roman" w:cs="Times New Roman"/>
           <w:b/>
@@ -124,89 +732,144 @@
           <w:szCs w:val="27"/>
           <w:lang w:val="en-US" w:eastAsia="es-MX"/>
         </w:rPr>
-      </w:pPr>
-      <w:r>
-        <w:rPr>
-          <w:rFonts w:ascii="Times New Roman" w:eastAsia="Times New Roman" w:hAnsi="Times New Roman" w:cs="Times New Roman"/>
-          <w:b/>
-          <w:bCs/>
-          <w:color w:val="000000"/>
-          <w:sz w:val="27"/>
-          <w:szCs w:val="27"/>
-          <w:lang w:val="en-US" w:eastAsia="es-MX"/>
-        </w:rPr>
-        <w:t>Postgraduate Alumni</w:t>
-      </w:r>
-    </w:p>
-    <w:p>
-      <w:pPr>
-        <w:numPr>
-          <w:ilvl w:val="0"/>
-          <w:numId w:val="1"/>
-        </w:numPr>
-        <w:spacing w:before="100" w:beforeAutospacing="1" w:after="100" w:afterAutospacing="1"/>
-        <w:rPr>
-          <w:rFonts w:ascii="Times New Roman" w:eastAsia="Times New Roman" w:hAnsi="Times New Roman" w:cs="Times New Roman"/>
-          <w:color w:val="000000"/>
-          <w:lang w:val="en-US" w:eastAsia="es-MX"/>
-        </w:rPr>
-      </w:pPr>
-      <w:r>
-        <w:rPr>
-          <w:rFonts w:ascii="Times New Roman" w:eastAsia="Times New Roman" w:hAnsi="Times New Roman" w:cs="Times New Roman"/>
-          <w:color w:val="000000"/>
-          <w:lang w:val="en-US" w:eastAsia="es-MX"/>
-        </w:rPr>
-        <w:t xml:space="preserve">Francisca </w:t>
+        <w:t>Collaborators</w:t>
+      </w:r>
+    </w:p>
+    <w:p>
+      <w:pPr>
+        <w:spacing w:before="100" w:beforeAutospacing="1" w:after="100" w:afterAutospacing="1"/>
+        <w:rPr>
+          <w:rFonts w:ascii="Times New Roman" w:eastAsia="Times New Roman" w:hAnsi="Times New Roman" w:cs="Times New Roman"/>
+          <w:color w:val="000000"/>
+          <w:lang w:val="en-US" w:eastAsia="es-MX"/>
+        </w:rPr>
+      </w:pPr>
+      <w:r>
+        <w:rPr>
+          <w:rFonts w:ascii="Times New Roman" w:eastAsia="Times New Roman" w:hAnsi="Times New Roman" w:cs="Times New Roman"/>
+          <w:b/>
+          <w:bCs/>
+          <w:color w:val="000000"/>
+          <w:lang w:val="en-US" w:eastAsia="es-MX"/>
+        </w:rPr>
+        <w:t>Carlos Sandoval</w:t>
+      </w:r>
+      <w:r>
+        <w:rPr>
+          <w:rFonts w:ascii="Times New Roman" w:eastAsia="Times New Roman" w:hAnsi="Times New Roman" w:cs="Times New Roman"/>
+          <w:color w:val="000000"/>
+          <w:lang w:val="en-US" w:eastAsia="es-MX"/>
+        </w:rPr>
+        <w:t> — Vehicle Engineering</w:t>
+      </w:r>
+    </w:p>
+    <w:p>
+      <w:pPr>
+        <w:spacing w:before="100" w:beforeAutospacing="1" w:after="100" w:afterAutospacing="1"/>
+        <w:rPr>
+          <w:rFonts w:ascii="Times New Roman" w:eastAsia="Times New Roman" w:hAnsi="Times New Roman" w:cs="Times New Roman"/>
+          <w:color w:val="000000"/>
+          <w:lang w:val="en-US" w:eastAsia="es-MX"/>
+        </w:rPr>
+      </w:pPr>
+      <w:r>
+        <w:rPr>
+          <w:rFonts w:ascii="Times New Roman" w:eastAsia="Times New Roman" w:hAnsi="Times New Roman" w:cs="Times New Roman"/>
+          <w:b/>
+          <w:bCs/>
+          <w:color w:val="000000"/>
+          <w:lang w:val="en-US" w:eastAsia="es-MX"/>
+        </w:rPr>
+        <w:t>Álvaro González</w:t>
+      </w:r>
+      <w:r>
+        <w:rPr>
+          <w:rFonts w:ascii="Times New Roman" w:eastAsia="Times New Roman" w:hAnsi="Times New Roman" w:cs="Times New Roman"/>
+          <w:color w:val="000000"/>
+          <w:lang w:val="en-US" w:eastAsia="es-MX"/>
+        </w:rPr>
+        <w:t> — Department of Mechanical Engineering, PUCV</w:t>
+      </w:r>
+    </w:p>
+    <w:p>
+      <w:pPr>
+        <w:spacing w:before="100" w:beforeAutospacing="1" w:after="100" w:afterAutospacing="1"/>
+        <w:rPr>
+          <w:rFonts w:ascii="Times New Roman" w:eastAsia="Times New Roman" w:hAnsi="Times New Roman" w:cs="Times New Roman"/>
+          <w:color w:val="000000"/>
+          <w:lang w:val="en-US" w:eastAsia="es-MX"/>
+        </w:rPr>
+      </w:pPr>
+      <w:r>
+        <w:rPr>
+          <w:rFonts w:ascii="Times New Roman" w:eastAsia="Times New Roman" w:hAnsi="Times New Roman" w:cs="Times New Roman"/>
+          <w:b/>
+          <w:bCs/>
+          <w:color w:val="000000"/>
+          <w:lang w:val="en-US" w:eastAsia="es-MX"/>
+        </w:rPr>
+        <w:t>Fernando Vidal</w:t>
+      </w:r>
+      <w:r>
+        <w:rPr>
+          <w:rFonts w:ascii="Times New Roman" w:eastAsia="Times New Roman" w:hAnsi="Times New Roman" w:cs="Times New Roman"/>
+          <w:color w:val="000000"/>
+          <w:lang w:val="en-US" w:eastAsia="es-MX"/>
+        </w:rPr>
+        <w:t> — IUCN / Fauna Andina, Chile</w:t>
+      </w:r>
+    </w:p>
+    <w:p>
+      <w:pPr>
+        <w:spacing w:before="100" w:beforeAutospacing="1" w:after="100" w:afterAutospacing="1"/>
+        <w:rPr>
+          <w:rFonts w:ascii="Times New Roman" w:eastAsia="Times New Roman" w:hAnsi="Times New Roman" w:cs="Times New Roman"/>
+          <w:color w:val="000000"/>
+          <w:lang w:val="en-US" w:eastAsia="es-MX"/>
+        </w:rPr>
+      </w:pPr>
+      <w:r>
+        <w:rPr>
+          <w:rFonts w:ascii="Times New Roman" w:eastAsia="Times New Roman" w:hAnsi="Times New Roman" w:cs="Times New Roman"/>
+          <w:b/>
+          <w:bCs/>
+          <w:color w:val="000000"/>
+          <w:lang w:val="en-US" w:eastAsia="es-MX"/>
+        </w:rPr>
+        <w:t xml:space="preserve">María </w:t>
       </w:r>
       <w:proofErr w:type="spellStart"/>
       <w:r>
         <w:rPr>
           <w:rFonts w:ascii="Times New Roman" w:eastAsia="Times New Roman" w:hAnsi="Times New Roman" w:cs="Times New Roman"/>
-          <w:color w:val="000000"/>
-          <w:lang w:val="en-US" w:eastAsia="es-MX"/>
-        </w:rPr>
-        <w:t>Villarroel</w:t>
+          <w:b/>
+          <w:bCs/>
+          <w:color w:val="000000"/>
+          <w:lang w:val="en-US" w:eastAsia="es-MX"/>
+        </w:rPr>
+        <w:t>Angélica</w:t>
       </w:r>
       <w:proofErr w:type="spellEnd"/>
       <w:r>
         <w:rPr>
           <w:rFonts w:ascii="Times New Roman" w:eastAsia="Times New Roman" w:hAnsi="Times New Roman" w:cs="Times New Roman"/>
-          <w:color w:val="000000"/>
-          <w:lang w:val="en-US" w:eastAsia="es-MX"/>
-        </w:rPr>
-        <w:t>, MSc</w:t>
-      </w:r>
-    </w:p>
-    <w:p>
-      <w:pPr>
-        <w:numPr>
-          <w:ilvl w:val="0"/>
-          <w:numId w:val="1"/>
-        </w:numPr>
-        <w:spacing w:before="100" w:beforeAutospacing="1" w:after="100" w:afterAutospacing="1"/>
-        <w:rPr>
-          <w:rFonts w:ascii="Times New Roman" w:eastAsia="Times New Roman" w:hAnsi="Times New Roman" w:cs="Times New Roman"/>
-          <w:color w:val="000000"/>
-          <w:lang w:val="en-US" w:eastAsia="es-MX"/>
-        </w:rPr>
-      </w:pPr>
-      <w:r>
-        <w:rPr>
-          <w:rFonts w:ascii="Times New Roman" w:eastAsia="Times New Roman" w:hAnsi="Times New Roman" w:cs="Times New Roman"/>
-          <w:color w:val="000000"/>
-          <w:lang w:val="en-US" w:eastAsia="es-MX"/>
-        </w:rPr>
-        <w:t xml:space="preserve">Samuel </w:t>
+          <w:b/>
+          <w:bCs/>
+          <w:color w:val="000000"/>
+          <w:lang w:val="en-US" w:eastAsia="es-MX"/>
+        </w:rPr>
+        <w:t xml:space="preserve"> </w:t>
       </w:r>
       <w:proofErr w:type="spellStart"/>
       <w:r>
         <w:rPr>
           <w:rFonts w:ascii="Times New Roman" w:eastAsia="Times New Roman" w:hAnsi="Times New Roman" w:cs="Times New Roman"/>
-          <w:color w:val="000000"/>
-          <w:lang w:val="en-US" w:eastAsia="es-MX"/>
-        </w:rPr>
-        <w:t>Núñez</w:t>
+          <w:b/>
+          <w:bCs/>
+          <w:color w:val="000000"/>
+          <w:lang w:val="en-US" w:eastAsia="es-MX"/>
+        </w:rPr>
+        <w:t>Miglino</w:t>
       </w:r>
       <w:proofErr w:type="spellEnd"/>
       <w:r>
@@ -215,91 +878,7 @@
           <w:color w:val="000000"/>
           <w:lang w:val="en-US" w:eastAsia="es-MX"/>
         </w:rPr>
-        <w:t>-Cook, MSc</w:t>
-      </w:r>
-    </w:p>
-    <w:p>
-      <w:pPr>
-        <w:rPr>
-          <w:rFonts w:ascii="Times New Roman" w:eastAsia="Times New Roman" w:hAnsi="Times New Roman" w:cs="Times New Roman"/>
-          <w:lang w:val="en-US" w:eastAsia="es-MX"/>
-        </w:rPr>
-      </w:pPr>
-    </w:p>
-    <w:p>
-      <w:pPr>
-        <w:spacing w:before="100" w:beforeAutospacing="1" w:after="100" w:afterAutospacing="1"/>
-        <w:outlineLvl w:val="2"/>
-        <w:rPr>
-          <w:rFonts w:ascii="Times New Roman" w:eastAsia="Times New Roman" w:hAnsi="Times New Roman" w:cs="Times New Roman"/>
-          <w:b/>
-          <w:bCs/>
-          <w:color w:val="000000"/>
-          <w:sz w:val="27"/>
-          <w:szCs w:val="27"/>
-          <w:lang w:val="en-US" w:eastAsia="es-MX"/>
-        </w:rPr>
-      </w:pPr>
-      <w:r>
-        <w:rPr>
-          <w:rFonts w:ascii="Times New Roman" w:eastAsia="Times New Roman" w:hAnsi="Times New Roman" w:cs="Times New Roman"/>
-          <w:b/>
-          <w:bCs/>
-          <w:color w:val="000000"/>
-          <w:sz w:val="27"/>
-          <w:szCs w:val="27"/>
-          <w:lang w:val="en-US" w:eastAsia="es-MX"/>
-        </w:rPr>
-        <w:t>Undergraduate Students</w:t>
-      </w:r>
-    </w:p>
-    <w:p>
-      <w:pPr>
-        <w:spacing w:before="100" w:beforeAutospacing="1" w:after="100" w:afterAutospacing="1"/>
-        <w:rPr>
-          <w:rFonts w:ascii="Times New Roman" w:eastAsia="Times New Roman" w:hAnsi="Times New Roman" w:cs="Times New Roman"/>
-          <w:color w:val="000000"/>
-          <w:lang w:val="en-US" w:eastAsia="es-MX"/>
-        </w:rPr>
-      </w:pPr>
-      <w:r>
-        <w:rPr>
-          <w:rFonts w:ascii="Times New Roman" w:eastAsia="Times New Roman" w:hAnsi="Times New Roman" w:cs="Times New Roman"/>
-          <w:i/>
-          <w:iCs/>
-          <w:color w:val="000000"/>
-          <w:lang w:val="en-US" w:eastAsia="es-MX"/>
-        </w:rPr>
-        <w:t>(Current and former thesis students)</w:t>
-      </w:r>
-    </w:p>
-    <w:p>
-      <w:pPr>
-        <w:spacing w:before="100" w:beforeAutospacing="1" w:after="100" w:afterAutospacing="1"/>
-        <w:rPr>
-          <w:rFonts w:ascii="Times New Roman" w:eastAsia="Times New Roman" w:hAnsi="Times New Roman" w:cs="Times New Roman"/>
-          <w:color w:val="000000"/>
-          <w:lang w:val="en-US" w:eastAsia="es-MX"/>
-        </w:rPr>
-      </w:pPr>
-      <w:r>
-        <w:rPr>
-          <w:rFonts w:ascii="Times New Roman" w:eastAsia="Times New Roman" w:hAnsi="Times New Roman" w:cs="Times New Roman"/>
-          <w:b/>
-          <w:bCs/>
-          <w:color w:val="000000"/>
-          <w:lang w:val="en-US" w:eastAsia="es-MX"/>
-        </w:rPr>
-        <w:t>Class of 2025</w:t>
-      </w:r>
-      <w:r>
-        <w:rPr>
-          <w:rFonts w:ascii="Times New Roman" w:eastAsia="Times New Roman" w:hAnsi="Times New Roman" w:cs="Times New Roman"/>
-          <w:color w:val="000000"/>
-          <w:lang w:val="en-US" w:eastAsia="es-MX"/>
-        </w:rPr>
-        <w:br/>
-        <w:t xml:space="preserve">Francisca San Martín · Javier Rivera · Danae Tapia · Francisca </w:t>
+        <w:t xml:space="preserve"> — University of </w:t>
       </w:r>
       <w:proofErr w:type="spellStart"/>
       <w:r>
@@ -308,7 +887,7 @@
           <w:color w:val="000000"/>
           <w:lang w:val="en-US" w:eastAsia="es-MX"/>
         </w:rPr>
-        <w:t>Leiva</w:t>
+        <w:t>Marília</w:t>
       </w:r>
       <w:proofErr w:type="spellEnd"/>
       <w:r>
@@ -317,499 +896,11 @@
           <w:color w:val="000000"/>
           <w:lang w:val="en-US" w:eastAsia="es-MX"/>
         </w:rPr>
-        <w:t xml:space="preserve"> · Ruth Camargo · Joaquín </w:t>
-      </w:r>
-      <w:proofErr w:type="spellStart"/>
-      <w:r>
-        <w:rPr>
-          <w:rFonts w:ascii="Times New Roman" w:eastAsia="Times New Roman" w:hAnsi="Times New Roman" w:cs="Times New Roman"/>
-          <w:color w:val="000000"/>
-          <w:lang w:val="en-US" w:eastAsia="es-MX"/>
-        </w:rPr>
-        <w:t>Olivos</w:t>
-      </w:r>
-      <w:proofErr w:type="spellEnd"/>
-      <w:r>
-        <w:rPr>
-          <w:rFonts w:ascii="Times New Roman" w:eastAsia="Times New Roman" w:hAnsi="Times New Roman" w:cs="Times New Roman"/>
-          <w:color w:val="000000"/>
-          <w:lang w:val="en-US" w:eastAsia="es-MX"/>
-        </w:rPr>
-        <w:t xml:space="preserve"> · </w:t>
-      </w:r>
-      <w:proofErr w:type="spellStart"/>
-      <w:r>
-        <w:rPr>
-          <w:rFonts w:ascii="Times New Roman" w:eastAsia="Times New Roman" w:hAnsi="Times New Roman" w:cs="Times New Roman"/>
-          <w:color w:val="000000"/>
-          <w:lang w:val="en-US" w:eastAsia="es-MX"/>
-        </w:rPr>
-        <w:t>Resef</w:t>
-      </w:r>
-      <w:proofErr w:type="spellEnd"/>
-      <w:r>
-        <w:rPr>
-          <w:rFonts w:ascii="Times New Roman" w:eastAsia="Times New Roman" w:hAnsi="Times New Roman" w:cs="Times New Roman"/>
-          <w:color w:val="000000"/>
-          <w:lang w:val="en-US" w:eastAsia="es-MX"/>
-        </w:rPr>
-        <w:t xml:space="preserve"> Contreras (UST) · Willy Espinoza · Mónica </w:t>
-      </w:r>
-      <w:proofErr w:type="spellStart"/>
-      <w:r>
-        <w:rPr>
-          <w:rFonts w:ascii="Times New Roman" w:eastAsia="Times New Roman" w:hAnsi="Times New Roman" w:cs="Times New Roman"/>
-          <w:color w:val="000000"/>
-          <w:lang w:val="en-US" w:eastAsia="es-MX"/>
-        </w:rPr>
-        <w:t>Conforti</w:t>
-      </w:r>
-      <w:proofErr w:type="spellEnd"/>
-    </w:p>
-    <w:p>
-      <w:pPr>
-        <w:spacing w:before="100" w:beforeAutospacing="1" w:after="100" w:afterAutospacing="1"/>
-        <w:rPr>
-          <w:rFonts w:ascii="Times New Roman" w:eastAsia="Times New Roman" w:hAnsi="Times New Roman" w:cs="Times New Roman"/>
-          <w:color w:val="000000"/>
-          <w:lang w:val="en-US" w:eastAsia="es-MX"/>
-        </w:rPr>
-      </w:pPr>
-      <w:r>
-        <w:rPr>
-          <w:rFonts w:ascii="Times New Roman" w:eastAsia="Times New Roman" w:hAnsi="Times New Roman" w:cs="Times New Roman"/>
-          <w:b/>
-          <w:bCs/>
-          <w:color w:val="000000"/>
-          <w:lang w:val="en-US" w:eastAsia="es-MX"/>
-        </w:rPr>
-        <w:t>Class of 2024</w:t>
-      </w:r>
-      <w:r>
-        <w:rPr>
-          <w:rFonts w:ascii="Times New Roman" w:eastAsia="Times New Roman" w:hAnsi="Times New Roman" w:cs="Times New Roman"/>
-          <w:color w:val="000000"/>
-          <w:lang w:val="en-US" w:eastAsia="es-MX"/>
-        </w:rPr>
-        <w:br/>
-      </w:r>
-      <w:proofErr w:type="spellStart"/>
-      <w:r>
-        <w:rPr>
-          <w:rFonts w:ascii="Times New Roman" w:eastAsia="Times New Roman" w:hAnsi="Times New Roman" w:cs="Times New Roman"/>
-          <w:color w:val="000000"/>
-          <w:lang w:val="en-US" w:eastAsia="es-MX"/>
-        </w:rPr>
-        <w:t>Matías</w:t>
-      </w:r>
-      <w:proofErr w:type="spellEnd"/>
-      <w:r>
-        <w:rPr>
-          <w:rFonts w:ascii="Times New Roman" w:eastAsia="Times New Roman" w:hAnsi="Times New Roman" w:cs="Times New Roman"/>
-          <w:color w:val="000000"/>
-          <w:lang w:val="en-US" w:eastAsia="es-MX"/>
-        </w:rPr>
-        <w:t xml:space="preserve"> Vergara · Armando </w:t>
-      </w:r>
-      <w:proofErr w:type="spellStart"/>
-      <w:r>
-        <w:rPr>
-          <w:rFonts w:ascii="Times New Roman" w:eastAsia="Times New Roman" w:hAnsi="Times New Roman" w:cs="Times New Roman"/>
-          <w:color w:val="000000"/>
-          <w:lang w:val="en-US" w:eastAsia="es-MX"/>
-        </w:rPr>
-        <w:t>Norambuena</w:t>
-      </w:r>
-      <w:proofErr w:type="spellEnd"/>
-      <w:r>
-        <w:rPr>
-          <w:rFonts w:ascii="Times New Roman" w:eastAsia="Times New Roman" w:hAnsi="Times New Roman" w:cs="Times New Roman"/>
-          <w:color w:val="000000"/>
-          <w:lang w:val="en-US" w:eastAsia="es-MX"/>
-        </w:rPr>
-        <w:t xml:space="preserve"> · Paula Cerda</w:t>
-      </w:r>
-    </w:p>
-    <w:p>
-      <w:pPr>
-        <w:spacing w:before="100" w:beforeAutospacing="1" w:after="100" w:afterAutospacing="1"/>
-        <w:rPr>
-          <w:rFonts w:ascii="Times New Roman" w:eastAsia="Times New Roman" w:hAnsi="Times New Roman" w:cs="Times New Roman"/>
-          <w:color w:val="000000"/>
-          <w:lang w:val="en-US" w:eastAsia="es-MX"/>
-        </w:rPr>
-      </w:pPr>
-      <w:r>
-        <w:rPr>
-          <w:rFonts w:ascii="Times New Roman" w:eastAsia="Times New Roman" w:hAnsi="Times New Roman" w:cs="Times New Roman"/>
-          <w:b/>
-          <w:bCs/>
-          <w:color w:val="000000"/>
-          <w:lang w:val="en-US" w:eastAsia="es-MX"/>
-        </w:rPr>
-        <w:t>Class of 2023</w:t>
-      </w:r>
-      <w:r>
-        <w:rPr>
-          <w:rFonts w:ascii="Times New Roman" w:eastAsia="Times New Roman" w:hAnsi="Times New Roman" w:cs="Times New Roman"/>
-          <w:color w:val="000000"/>
-          <w:lang w:val="en-US" w:eastAsia="es-MX"/>
-        </w:rPr>
-        <w:br/>
-      </w:r>
-      <w:proofErr w:type="spellStart"/>
-      <w:r>
-        <w:rPr>
-          <w:rFonts w:ascii="Times New Roman" w:eastAsia="Times New Roman" w:hAnsi="Times New Roman" w:cs="Times New Roman"/>
-          <w:color w:val="000000"/>
-          <w:lang w:val="en-US" w:eastAsia="es-MX"/>
-        </w:rPr>
-        <w:t>Jovely</w:t>
-      </w:r>
-      <w:proofErr w:type="spellEnd"/>
-      <w:r>
-        <w:rPr>
-          <w:rFonts w:ascii="Times New Roman" w:eastAsia="Times New Roman" w:hAnsi="Times New Roman" w:cs="Times New Roman"/>
-          <w:color w:val="000000"/>
-          <w:lang w:val="en-US" w:eastAsia="es-MX"/>
-        </w:rPr>
-        <w:t xml:space="preserve"> Silva · Constanza </w:t>
-      </w:r>
-      <w:proofErr w:type="spellStart"/>
-      <w:r>
-        <w:rPr>
-          <w:rFonts w:ascii="Times New Roman" w:eastAsia="Times New Roman" w:hAnsi="Times New Roman" w:cs="Times New Roman"/>
-          <w:color w:val="000000"/>
-          <w:lang w:val="en-US" w:eastAsia="es-MX"/>
-        </w:rPr>
-        <w:t>Quizás</w:t>
-      </w:r>
-      <w:proofErr w:type="spellEnd"/>
-      <w:r>
-        <w:rPr>
-          <w:rFonts w:ascii="Times New Roman" w:eastAsia="Times New Roman" w:hAnsi="Times New Roman" w:cs="Times New Roman"/>
-          <w:color w:val="000000"/>
-          <w:lang w:val="en-US" w:eastAsia="es-MX"/>
-        </w:rPr>
-        <w:t xml:space="preserve"> · Noelia Arroyo · Valentina Zamorano · Giovanni Aguilar · </w:t>
-      </w:r>
-      <w:proofErr w:type="spellStart"/>
-      <w:r>
-        <w:rPr>
-          <w:rFonts w:ascii="Times New Roman" w:eastAsia="Times New Roman" w:hAnsi="Times New Roman" w:cs="Times New Roman"/>
-          <w:color w:val="000000"/>
-          <w:lang w:val="en-US" w:eastAsia="es-MX"/>
-        </w:rPr>
-        <w:t>Guiseppe</w:t>
-      </w:r>
-      <w:proofErr w:type="spellEnd"/>
-      <w:r>
-        <w:rPr>
-          <w:rFonts w:ascii="Times New Roman" w:eastAsia="Times New Roman" w:hAnsi="Times New Roman" w:cs="Times New Roman"/>
-          <w:color w:val="000000"/>
-          <w:lang w:val="en-US" w:eastAsia="es-MX"/>
-        </w:rPr>
-        <w:t xml:space="preserve"> </w:t>
-      </w:r>
-      <w:proofErr w:type="spellStart"/>
-      <w:r>
-        <w:rPr>
-          <w:rFonts w:ascii="Times New Roman" w:eastAsia="Times New Roman" w:hAnsi="Times New Roman" w:cs="Times New Roman"/>
-          <w:color w:val="000000"/>
-          <w:lang w:val="en-US" w:eastAsia="es-MX"/>
-        </w:rPr>
-        <w:t>Balsarini</w:t>
-      </w:r>
-      <w:proofErr w:type="spellEnd"/>
-      <w:r>
-        <w:rPr>
-          <w:rFonts w:ascii="Times New Roman" w:eastAsia="Times New Roman" w:hAnsi="Times New Roman" w:cs="Times New Roman"/>
-          <w:color w:val="000000"/>
-          <w:lang w:val="en-US" w:eastAsia="es-MX"/>
-        </w:rPr>
-        <w:t xml:space="preserve"> · Tamara </w:t>
-      </w:r>
-      <w:proofErr w:type="spellStart"/>
-      <w:r>
-        <w:rPr>
-          <w:rFonts w:ascii="Times New Roman" w:eastAsia="Times New Roman" w:hAnsi="Times New Roman" w:cs="Times New Roman"/>
-          <w:color w:val="000000"/>
-          <w:lang w:val="en-US" w:eastAsia="es-MX"/>
-        </w:rPr>
-        <w:t>Lazcano</w:t>
-      </w:r>
-      <w:proofErr w:type="spellEnd"/>
-    </w:p>
-    <w:p>
-      <w:pPr>
-        <w:spacing w:before="100" w:beforeAutospacing="1" w:after="100" w:afterAutospacing="1"/>
-        <w:rPr>
-          <w:rFonts w:ascii="Times New Roman" w:eastAsia="Times New Roman" w:hAnsi="Times New Roman" w:cs="Times New Roman"/>
-          <w:color w:val="000000"/>
-          <w:lang w:val="en-US" w:eastAsia="es-MX"/>
-        </w:rPr>
-      </w:pPr>
-      <w:r>
-        <w:rPr>
-          <w:rFonts w:ascii="Times New Roman" w:eastAsia="Times New Roman" w:hAnsi="Times New Roman" w:cs="Times New Roman"/>
-          <w:b/>
-          <w:bCs/>
-          <w:color w:val="000000"/>
-          <w:lang w:val="en-US" w:eastAsia="es-MX"/>
-        </w:rPr>
-        <w:t>Class of 2022</w:t>
-      </w:r>
-      <w:r>
-        <w:rPr>
-          <w:rFonts w:ascii="Times New Roman" w:eastAsia="Times New Roman" w:hAnsi="Times New Roman" w:cs="Times New Roman"/>
-          <w:color w:val="000000"/>
-          <w:lang w:val="en-US" w:eastAsia="es-MX"/>
-        </w:rPr>
-        <w:br/>
-        <w:t xml:space="preserve">Leslie Belmar (UCT) · Mariana </w:t>
-      </w:r>
-      <w:proofErr w:type="spellStart"/>
-      <w:r>
-        <w:rPr>
-          <w:rFonts w:ascii="Times New Roman" w:eastAsia="Times New Roman" w:hAnsi="Times New Roman" w:cs="Times New Roman"/>
-          <w:color w:val="000000"/>
-          <w:lang w:val="en-US" w:eastAsia="es-MX"/>
-        </w:rPr>
-        <w:t>Manzor</w:t>
-      </w:r>
-      <w:proofErr w:type="spellEnd"/>
-    </w:p>
-    <w:p>
-      <w:pPr>
-        <w:rPr>
-          <w:rFonts w:ascii="Times New Roman" w:eastAsia="Times New Roman" w:hAnsi="Times New Roman" w:cs="Times New Roman"/>
-          <w:lang w:val="en-US" w:eastAsia="es-MX"/>
-        </w:rPr>
-      </w:pPr>
-      <w:r>
-        <w:rPr>
-          <w:rFonts w:ascii="Times New Roman" w:eastAsia="Times New Roman" w:hAnsi="Times New Roman" w:cs="Times New Roman"/>
-          <w:noProof/>
-          <w:lang w:val="en-US" w:eastAsia="es-MX"/>
-        </w:rPr>
-        <w:pict w14:anchorId="16BC31E0">
-          <v:rect id="_x0000_i1025" alt="" style="width:441.9pt;height:.05pt;mso-width-percent:0;mso-height-percent:0;mso-width-percent:0;mso-height-percent:0" o:hralign="center" o:hrstd="t" o:hr="t" fillcolor="#a0a0a0" stroked="f"/>
-        </w:pict>
-      </w:r>
-    </w:p>
-    <w:p>
-      <w:pPr>
-        <w:spacing w:before="100" w:beforeAutospacing="1" w:after="100" w:afterAutospacing="1"/>
-        <w:outlineLvl w:val="2"/>
-        <w:rPr>
-          <w:rFonts w:ascii="Times New Roman" w:eastAsia="Times New Roman" w:hAnsi="Times New Roman" w:cs="Times New Roman"/>
-          <w:b/>
-          <w:bCs/>
-          <w:color w:val="000000"/>
-          <w:sz w:val="27"/>
-          <w:szCs w:val="27"/>
-          <w:lang w:val="en-US" w:eastAsia="es-MX"/>
-        </w:rPr>
-      </w:pPr>
-      <w:r>
-        <w:rPr>
-          <w:rFonts w:ascii="Times New Roman" w:eastAsia="Times New Roman" w:hAnsi="Times New Roman" w:cs="Times New Roman"/>
-          <w:b/>
-          <w:bCs/>
-          <w:color w:val="000000"/>
-          <w:sz w:val="27"/>
-          <w:szCs w:val="27"/>
-          <w:lang w:val="en-US" w:eastAsia="es-MX"/>
-        </w:rPr>
-        <w:t>Collaborators</w:t>
-      </w:r>
-    </w:p>
-    <w:p>
-      <w:pPr>
-        <w:numPr>
-          <w:ilvl w:val="0"/>
-          <w:numId w:val="2"/>
-        </w:numPr>
-        <w:spacing w:before="100" w:beforeAutospacing="1" w:after="100" w:afterAutospacing="1"/>
-        <w:rPr>
-          <w:rFonts w:ascii="Times New Roman" w:eastAsia="Times New Roman" w:hAnsi="Times New Roman" w:cs="Times New Roman"/>
-          <w:color w:val="000000"/>
-          <w:lang w:val="en-US" w:eastAsia="es-MX"/>
-        </w:rPr>
-      </w:pPr>
-      <w:r>
-        <w:rPr>
-          <w:rFonts w:ascii="Times New Roman" w:eastAsia="Times New Roman" w:hAnsi="Times New Roman" w:cs="Times New Roman"/>
-          <w:b/>
-          <w:bCs/>
-          <w:color w:val="000000"/>
-          <w:lang w:val="en-US" w:eastAsia="es-MX"/>
-        </w:rPr>
-        <w:t>Carlos Sandoval</w:t>
-      </w:r>
-      <w:r>
-        <w:rPr>
-          <w:rFonts w:ascii="Times New Roman" w:eastAsia="Times New Roman" w:hAnsi="Times New Roman" w:cs="Times New Roman"/>
-          <w:color w:val="000000"/>
-          <w:lang w:val="en-US" w:eastAsia="es-MX"/>
-        </w:rPr>
-        <w:t> — Vehicle Engineering</w:t>
-      </w:r>
-    </w:p>
-    <w:p>
-      <w:pPr>
-        <w:numPr>
-          <w:ilvl w:val="0"/>
-          <w:numId w:val="2"/>
-        </w:numPr>
-        <w:spacing w:before="100" w:beforeAutospacing="1" w:after="100" w:afterAutospacing="1"/>
-        <w:rPr>
-          <w:rFonts w:ascii="Times New Roman" w:eastAsia="Times New Roman" w:hAnsi="Times New Roman" w:cs="Times New Roman"/>
-          <w:color w:val="000000"/>
-          <w:lang w:val="en-US" w:eastAsia="es-MX"/>
-        </w:rPr>
-      </w:pPr>
-      <w:r>
-        <w:rPr>
-          <w:rFonts w:ascii="Times New Roman" w:eastAsia="Times New Roman" w:hAnsi="Times New Roman" w:cs="Times New Roman"/>
-          <w:b/>
-          <w:bCs/>
-          <w:color w:val="000000"/>
-          <w:lang w:val="en-US" w:eastAsia="es-MX"/>
-        </w:rPr>
-        <w:t>Álvaro González</w:t>
-      </w:r>
-      <w:r>
-        <w:rPr>
-          <w:rFonts w:ascii="Times New Roman" w:eastAsia="Times New Roman" w:hAnsi="Times New Roman" w:cs="Times New Roman"/>
-          <w:color w:val="000000"/>
-          <w:lang w:val="en-US" w:eastAsia="es-MX"/>
-        </w:rPr>
-        <w:t> — Department of Mechanical Engineering, PUCV</w:t>
-      </w:r>
-    </w:p>
-    <w:p>
-      <w:pPr>
-        <w:numPr>
-          <w:ilvl w:val="0"/>
-          <w:numId w:val="2"/>
-        </w:numPr>
-        <w:spacing w:before="100" w:beforeAutospacing="1" w:after="100" w:afterAutospacing="1"/>
-        <w:rPr>
-          <w:rFonts w:ascii="Times New Roman" w:eastAsia="Times New Roman" w:hAnsi="Times New Roman" w:cs="Times New Roman"/>
-          <w:color w:val="000000"/>
-          <w:lang w:val="en-US" w:eastAsia="es-MX"/>
-        </w:rPr>
-      </w:pPr>
-      <w:r>
-        <w:rPr>
-          <w:rFonts w:ascii="Times New Roman" w:eastAsia="Times New Roman" w:hAnsi="Times New Roman" w:cs="Times New Roman"/>
-          <w:b/>
-          <w:bCs/>
-          <w:color w:val="000000"/>
-          <w:lang w:val="en-US" w:eastAsia="es-MX"/>
-        </w:rPr>
-        <w:t>Fernando Vidal</w:t>
-      </w:r>
-      <w:r>
-        <w:rPr>
-          <w:rFonts w:ascii="Times New Roman" w:eastAsia="Times New Roman" w:hAnsi="Times New Roman" w:cs="Times New Roman"/>
-          <w:color w:val="000000"/>
-          <w:lang w:val="en-US" w:eastAsia="es-MX"/>
-        </w:rPr>
-        <w:t> — IUCN / Fauna Andina, Chile</w:t>
-      </w:r>
-    </w:p>
-    <w:p>
-      <w:pPr>
-        <w:numPr>
-          <w:ilvl w:val="0"/>
-          <w:numId w:val="2"/>
-        </w:numPr>
-        <w:spacing w:before="100" w:beforeAutospacing="1" w:after="100" w:afterAutospacing="1"/>
-        <w:rPr>
-          <w:rFonts w:ascii="Times New Roman" w:eastAsia="Times New Roman" w:hAnsi="Times New Roman" w:cs="Times New Roman"/>
-          <w:color w:val="000000"/>
-          <w:lang w:val="en-US" w:eastAsia="es-MX"/>
-        </w:rPr>
-      </w:pPr>
-      <w:r>
-        <w:rPr>
-          <w:rFonts w:ascii="Times New Roman" w:eastAsia="Times New Roman" w:hAnsi="Times New Roman" w:cs="Times New Roman"/>
-          <w:b/>
-          <w:bCs/>
-          <w:color w:val="000000"/>
-          <w:lang w:val="en-US" w:eastAsia="es-MX"/>
-        </w:rPr>
-        <w:t xml:space="preserve">María </w:t>
-      </w:r>
-      <w:proofErr w:type="spellStart"/>
-      <w:r>
-        <w:rPr>
-          <w:rFonts w:ascii="Times New Roman" w:eastAsia="Times New Roman" w:hAnsi="Times New Roman" w:cs="Times New Roman"/>
-          <w:b/>
-          <w:bCs/>
-          <w:color w:val="000000"/>
-          <w:lang w:val="en-US" w:eastAsia="es-MX"/>
-        </w:rPr>
-        <w:t>Angélica</w:t>
-      </w:r>
-      <w:proofErr w:type="spellEnd"/>
-      <w:r>
-        <w:rPr>
-          <w:rFonts w:ascii="Times New Roman" w:eastAsia="Times New Roman" w:hAnsi="Times New Roman" w:cs="Times New Roman"/>
-          <w:b/>
-          <w:bCs/>
-          <w:color w:val="000000"/>
-          <w:lang w:val="en-US" w:eastAsia="es-MX"/>
-        </w:rPr>
-        <w:t xml:space="preserve"> </w:t>
-      </w:r>
-      <w:proofErr w:type="spellStart"/>
-      <w:r>
-        <w:rPr>
-          <w:rFonts w:ascii="Times New Roman" w:eastAsia="Times New Roman" w:hAnsi="Times New Roman" w:cs="Times New Roman"/>
-          <w:b/>
-          <w:bCs/>
-          <w:color w:val="000000"/>
-          <w:lang w:val="en-US" w:eastAsia="es-MX"/>
-        </w:rPr>
-        <w:t>Miglino</w:t>
-      </w:r>
-      <w:proofErr w:type="spellEnd"/>
-      <w:r>
-        <w:rPr>
-          <w:rFonts w:ascii="Times New Roman" w:eastAsia="Times New Roman" w:hAnsi="Times New Roman" w:cs="Times New Roman"/>
-          <w:color w:val="000000"/>
-          <w:lang w:val="en-US" w:eastAsia="es-MX"/>
-        </w:rPr>
-        <w:t xml:space="preserve"> — University of </w:t>
-      </w:r>
-      <w:proofErr w:type="spellStart"/>
-      <w:r>
-        <w:rPr>
-          <w:rFonts w:ascii="Times New Roman" w:eastAsia="Times New Roman" w:hAnsi="Times New Roman" w:cs="Times New Roman"/>
-          <w:color w:val="000000"/>
-          <w:lang w:val="en-US" w:eastAsia="es-MX"/>
-        </w:rPr>
-        <w:t>Marília</w:t>
-      </w:r>
-      <w:proofErr w:type="spellEnd"/>
-      <w:r>
-        <w:rPr>
-          <w:rFonts w:ascii="Times New Roman" w:eastAsia="Times New Roman" w:hAnsi="Times New Roman" w:cs="Times New Roman"/>
-          <w:color w:val="000000"/>
-          <w:lang w:val="en-US" w:eastAsia="es-MX"/>
-        </w:rPr>
         <w:t xml:space="preserve"> (UNIMAR), Brazil</w:t>
       </w:r>
     </w:p>
     <w:p>
       <w:pPr>
-        <w:numPr>
-          <w:ilvl w:val="0"/>
-          <w:numId w:val="2"/>
-        </w:numPr>
         <w:spacing w:before="100" w:beforeAutospacing="1" w:after="100" w:afterAutospacing="1"/>
         <w:rPr>
           <w:rFonts w:ascii="Times New Roman" w:eastAsia="Times New Roman" w:hAnsi="Times New Roman" w:cs="Times New Roman"/>
@@ -847,7 +938,7 @@
 </file>
 
 <file path=word/numbering.xml><?xml version="1.0" encoding="utf-8"?>
-<w:numbering xmlns:wpc="http://schemas.microsoft.com/office/word/2010/wordprocessingCanvas" xmlns:cx="http://schemas.microsoft.com/office/drawing/2014/chartex" xmlns:cx1="http://schemas.microsoft.com/office/drawing/2015/9/8/chartex" xmlns:cx2="http://schemas.microsoft.com/office/drawing/2015/10/21/chartex" xmlns:cx3="http://schemas.microsoft.com/office/drawing/2016/5/9/chartex" xmlns:cx4="http://schemas.microsoft.com/office/drawing/2016/5/10/chartex" xmlns:cx5="http://schemas.microsoft.com/office/drawing/2016/5/11/chartex" xmlns:cx6="http://schemas.microsoft.com/office/drawing/2016/5/12/chartex" xmlns:cx7="http://schemas.microsoft.com/office/drawing/2016/5/13/chartex" xmlns:cx8="http://schemas.microsoft.com/office/drawing/2016/5/14/chartex" xmlns:mc="http://schemas.openxmlformats.org/markup-compatibility/2006" xmlns:aink="http://schemas.microsoft.com/office/drawing/2016/ink" xmlns:am3d="http://schemas.microsoft.com/office/drawing/2017/model3d" xmlns:o="urn:schemas-microsoft-com:office:office" xmlns:oel="http://schemas.microsoft.com/office/2019/extlst" xmlns:r="http://schemas.openxmlformats.org/officeDocument/2006/relationships" xmlns:m="http://schemas.openxmlformats.org/officeDocument/2006/math" xmlns:v="urn:schemas-microsoft-com:vml" xmlns:wp14="http://schemas.microsoft.com/office/word/2010/wordprocessingDrawing" xmlns:wp="http://schemas.openxmlformats.org/drawingml/2006/wordprocessingDrawing" xmlns:w10="urn:schemas-microsoft-com:office:word" xmlns:w="http://schemas.openxmlformats.org/wordprocessingml/2006/main" xmlns:w14="http://schemas.microsoft.com/office/word/2010/wordml" xmlns:w15="http://schemas.microsoft.com/office/word/2012/wordml" xmlns:w16cex="http://schemas.microsoft.com/office/word/2018/wordml/cex" xmlns:w16cid="http://schemas.microsoft.com/office/word/2016/wordml/cid" xmlns:w16="http://schemas.microsoft.com/office/word/2018/wordml" xmlns:w16sdtdh="http://schemas.microsoft.com/office/word/2020/wordml/sdtdatahash" xmlns:w16se="http://schemas.microsoft.com/office/word/2015/wordml/symex" xmlns:wpg="http://schemas.microsoft.com/office/word/2010/wordprocessingGroup" xmlns:wpi="http://schemas.microsoft.com/office/word/2010/wordprocessingInk" xmlns:wne="http://schemas.microsoft.com/office/word/2006/wordml" xmlns:wps="http://schemas.microsoft.com/office/word/2010/wordprocessingShape" mc:Ignorable="w14 w15 w16se w16cid w16 w16cex w16sdtdh wp14">
+<w:numbering xmlns:wpc="http://schemas.microsoft.com/office/word/2010/wordprocessingCanvas" xmlns:cx="http://schemas.microsoft.com/office/drawing/2014/chartex" xmlns:cx1="http://schemas.microsoft.com/office/drawing/2015/9/8/chartex" xmlns:cx2="http://schemas.microsoft.com/office/drawing/2015/10/21/chartex" xmlns:cx3="http://schemas.microsoft.com/office/drawing/2016/5/9/chartex" xmlns:cx4="http://schemas.microsoft.com/office/drawing/2016/5/10/chartex" xmlns:cx5="http://schemas.microsoft.com/office/drawing/2016/5/11/chartex" xmlns:cx6="http://schemas.microsoft.com/office/drawing/2016/5/12/chartex" xmlns:cx7="http://schemas.microsoft.com/office/drawing/2016/5/13/chartex" xmlns:cx8="http://schemas.microsoft.com/office/drawing/2016/5/14/chartex" xmlns:mc="http://schemas.openxmlformats.org/markup-compatibility/2006" xmlns:aink="http://schemas.microsoft.com/office/drawing/2016/ink" xmlns:am3d="http://schemas.microsoft.com/office/drawing/2017/model3d" xmlns:o="urn:schemas-microsoft-com:office:office" xmlns:r="http://schemas.openxmlformats.org/officeDocument/2006/relationships" xmlns:m="http://schemas.openxmlformats.org/officeDocument/2006/math" xmlns:v="urn:schemas-microsoft-com:vml" xmlns:wp14="http://schemas.microsoft.com/office/word/2010/wordprocessingDrawing" xmlns:wp="http://schemas.openxmlformats.org/drawingml/2006/wordprocessingDrawing" xmlns:w10="urn:schemas-microsoft-com:office:word" xmlns:w="http://schemas.openxmlformats.org/wordprocessingml/2006/main" xmlns:w14="http://schemas.microsoft.com/office/word/2010/wordml" xmlns:w15="http://schemas.microsoft.com/office/word/2012/wordml" xmlns:w16cex="http://schemas.microsoft.com/office/word/2018/wordml/cex" xmlns:w16cid="http://schemas.microsoft.com/office/word/2016/wordml/cid" xmlns:w16="http://schemas.microsoft.com/office/word/2018/wordml" xmlns:w16sdtdh="http://schemas.microsoft.com/office/word/2020/wordml/sdtdatahash" xmlns:w16se="http://schemas.microsoft.com/office/word/2015/wordml/symex" xmlns:wpg="http://schemas.microsoft.com/office/word/2010/wordprocessingGroup" xmlns:wpi="http://schemas.microsoft.com/office/word/2010/wordprocessingInk" xmlns:wne="http://schemas.microsoft.com/office/word/2006/wordml" xmlns:wps="http://schemas.microsoft.com/office/word/2010/wordprocessingShape" mc:Ignorable="w14 w15 w16se w16cid w16 w16cex w16sdtdh wp14">
   <w:abstractNum w:abstractNumId="0" w15:restartNumberingAfterBreak="0">
     <w:nsid w:val="0E64389F"/>
     <w:multiLevelType w:val="multilevel"/>
@@ -1146,10 +1237,10 @@
       </w:rPr>
     </w:lvl>
   </w:abstractNum>
-  <w:num w:numId="1" w16cid:durableId="587082952">
+  <w:num w:numId="1">
     <w:abstractNumId w:val="1"/>
   </w:num>
-  <w:num w:numId="2" w16cid:durableId="753554426">
+  <w:num w:numId="2">
     <w:abstractNumId w:val="0"/>
   </w:num>
 </w:numbering>

</xml_diff>